<commit_message>
fix: volver a escanear con IA vuelve a pasar por el paso 3, y actualiza el manual de usuario a la v1.6
- Paso 4: el boton "Volver a escanear con IA" ya persiste el archivo subido
  por navegador (antes se perdia al borrarse el temporal) y ya no se salta
  el paso 3 en una revision forzada (el flag es_fuente que se reporta al
  frontend ahora tambien considera el forzado, no solo la clasificacion
  original).
- Se guarda ruta_origen en la respuesta del analisis en vivo para que el
  boton de re-escaneo siempre tenga una ruta real que releer.
- Color "Propuesto" en los campos de llenado (Pasos 5 y 6): gris mas fuerte
  en vez del gris apagado original, para que no se pierda visualmente.
- Manual de usuario actualizado a la version 1.6: nueva fila en el
  historial de versiones y 3 paginas de adenda (re-escaneo siempre
  disponible, enlaces de descarga de copia de referencia, color
  "Propuesto"), con capturas reales del portal.
</commit_message>
<xml_diff>
--- a/backend/app/gobierno_de_aplicaciones/datos/referencia/tdd_nivel2/_estable/56.docx
+++ b/backend/app/gobierno_de_aplicaciones/datos/referencia/tdd_nivel2/_estable/56.docx
@@ -60,7 +60,7 @@
           <w:bCs/>
           <w:lang w:val="es-MX"/>
         </w:rPr>
-        <w:t>Nivel objetivo: Gobierno controlado y documentado (Nivel 2)  ·  Aplicativo: Enrutador de correos  ·  24/09/2026  ·  Primera parte: secciones 0 a 3</w:t>
+        <w:t>Nivel objetivo: Gobierno controlado y documentado (Nivel 2)  ·  Aplicativo: Prefect (Orquestador de tableros)  ·  24/09/2026  ·  Primera parte: secciones 0 a 3</w:t>
       </w:r>
     </w:p>
     <w:p>
@@ -171,7 +171,7 @@
                 <w:szCs w:val="18"/>
                 <w:lang w:val="es-MX"/>
               </w:rPr>
-              <w:t>TDD - Descripción Técnica del Aplicativo · Enrutador de correos</w:t>
+              <w:t>TDD - Descripción Técnica del Aplicativo · Prefect (Orquestador de tableros)</w:t>
             </w:r>
           </w:p>
         </w:tc>
@@ -959,7 +959,7 @@
               <w:rPr>
                 <w:b w:val="0"/>
               </w:rPr>
-              <w:t>Enrutador de correos</w:t>
+              <w:t>Prefect (Orquestador de tableros)</w:t>
             </w:r>
           </w:p>
         </w:tc>

</xml_diff>